<commit_message>
docs(informes): completar datos académicos y responsabilidades del grupo 3
Se agregan universidad, carrera, grupo, docente, fecha de entrega y los cuatro integrantes con sus responsabilidades, distinguiendo al responsable principal de cada caso. Se ajusta la paginación para que las tablas no queden cortadas. Las capturas, resultados y contenido técnico no cambian.
</commit_message>
<xml_diff>
--- a/informes/Informe_Caso1_Reserva_Concurrente.docx
+++ b/informes/Informe_Caso1_Reserva_Concurrente.docx
@@ -11,7 +11,19 @@
           <w:b/>
           <w:sz w:val="26"/>
         </w:rPr>
-        <w:t>UAM</w:t>
+        <w:t>Universidad Americana (UAM)</w:t>
+      </w:r>
+    </w:p>
+    <w:p>
+      <w:pPr>
+        <w:jc w:val="center"/>
+      </w:pPr>
+      <w:r>
+        <w:rPr>
+          <w:b w:val="0"/>
+          <w:sz w:val="24"/>
+        </w:rPr>
+        <w:t>Ingeniería en Sistemas</w:t>
       </w:r>
     </w:p>
     <w:p>
@@ -54,6 +66,7 @@
     </w:p>
     <w:p>
       <w:pPr>
+        <w:keepNext/>
         <w:jc w:val="center"/>
       </w:pPr>
       <w:r>
@@ -75,12 +88,18 @@
         <w:gridCol w:w="4703"/>
       </w:tblGrid>
       <w:tr>
+        <w:trPr>
+          <w:cantSplit/>
+        </w:trPr>
         <w:tc>
           <w:tcPr>
             <w:tcW w:type="dxa" w:w="2551"/>
             <w:shd w:val="clear" w:color="auto" w:fill="1F3A5F"/>
           </w:tcPr>
           <w:p>
+            <w:pPr>
+              <w:keepNext/>
+            </w:pPr>
             <w:r/>
             <w:r>
               <w:rPr>
@@ -98,6 +117,9 @@
             <w:shd w:val="clear" w:color="auto" w:fill="1F3A5F"/>
           </w:tcPr>
           <w:p>
+            <w:pPr>
+              <w:keepNext/>
+            </w:pPr>
             <w:r/>
             <w:r>
               <w:rPr>
@@ -111,11 +133,17 @@
         </w:tc>
       </w:tr>
       <w:tr>
+        <w:trPr>
+          <w:cantSplit/>
+        </w:trPr>
         <w:tc>
           <w:tcPr>
             <w:tcW w:type="dxa" w:w="2551"/>
           </w:tcPr>
           <w:p>
+            <w:pPr>
+              <w:keepNext/>
+            </w:pPr>
             <w:r/>
             <w:r>
               <w:rPr>
@@ -130,22 +158,70 @@
             <w:tcW w:type="dxa" w:w="6520"/>
           </w:tcPr>
           <w:p>
+            <w:pPr>
+              <w:keepNext/>
+            </w:pPr>
             <w:r/>
             <w:r>
               <w:rPr>
                 <w:sz w:val="19"/>
               </w:rPr>
-              <w:t>Trabajo grupal (3 integrantes)</w:t>
+              <w:t>Trabajo grupal</w:t>
             </w:r>
           </w:p>
         </w:tc>
       </w:tr>
       <w:tr>
+        <w:trPr>
+          <w:cantSplit/>
+        </w:trPr>
         <w:tc>
           <w:tcPr>
             <w:tcW w:type="dxa" w:w="2551"/>
           </w:tcPr>
           <w:p>
+            <w:pPr>
+              <w:keepNext/>
+            </w:pPr>
+            <w:r/>
+            <w:r>
+              <w:rPr>
+                <w:sz w:val="19"/>
+              </w:rPr>
+              <w:t>Grupo</w:t>
+            </w:r>
+          </w:p>
+        </w:tc>
+        <w:tc>
+          <w:tcPr>
+            <w:tcW w:type="dxa" w:w="6520"/>
+          </w:tcPr>
+          <w:p>
+            <w:pPr>
+              <w:keepNext/>
+            </w:pPr>
+            <w:r/>
+            <w:r>
+              <w:rPr>
+                <w:sz w:val="19"/>
+              </w:rPr>
+              <w:t>3</w:t>
+            </w:r>
+          </w:p>
+        </w:tc>
+      </w:tr>
+      <w:tr>
+        <w:trPr>
+          <w:cantSplit/>
+        </w:trPr>
+        <w:tc>
+          <w:tcPr>
+            <w:tcW w:type="dxa" w:w="2551"/>
+          </w:tcPr>
+          <w:p>
+            <w:pPr>
+              <w:keepNext/>
+            </w:pPr>
             <w:r/>
             <w:r>
               <w:rPr>
@@ -160,24 +236,31 @@
             <w:tcW w:type="dxa" w:w="6520"/>
           </w:tcPr>
           <w:p>
+            <w:pPr>
+              <w:keepNext/>
+            </w:pPr>
             <w:r/>
             <w:r>
               <w:rPr>
-                <w:b/>
-                <w:color w:val="B03A2E"/>
                 <w:sz w:val="19"/>
               </w:rPr>
-              <w:t>[Pendiente]</w:t>
+              <w:t>MSc. Freddy Luis López Barrios</w:t>
             </w:r>
           </w:p>
         </w:tc>
       </w:tr>
       <w:tr>
+        <w:trPr>
+          <w:cantSplit/>
+        </w:trPr>
         <w:tc>
           <w:tcPr>
             <w:tcW w:type="dxa" w:w="2551"/>
           </w:tcPr>
           <w:p>
+            <w:pPr>
+              <w:keepNext/>
+            </w:pPr>
             <w:r/>
             <w:r>
               <w:rPr>
@@ -192,6 +275,9 @@
             <w:tcW w:type="dxa" w:w="6520"/>
           </w:tcPr>
           <w:p>
+            <w:pPr>
+              <w:keepNext/>
+            </w:pPr>
             <w:r/>
             <w:r>
               <w:rPr>
@@ -203,11 +289,17 @@
         </w:tc>
       </w:tr>
       <w:tr>
+        <w:trPr>
+          <w:cantSplit/>
+        </w:trPr>
         <w:tc>
           <w:tcPr>
             <w:tcW w:type="dxa" w:w="2551"/>
           </w:tcPr>
           <w:p>
+            <w:pPr>
+              <w:keepNext/>
+            </w:pPr>
             <w:r/>
             <w:r>
               <w:rPr>
@@ -222,19 +314,23 @@
             <w:tcW w:type="dxa" w:w="6520"/>
           </w:tcPr>
           <w:p>
+            <w:pPr>
+              <w:keepNext/>
+            </w:pPr>
             <w:r/>
             <w:r>
               <w:rPr>
-                <w:b/>
-                <w:color w:val="B03A2E"/>
                 <w:sz w:val="19"/>
               </w:rPr>
-              <w:t>[Pendiente]</w:t>
+              <w:t>29 de octubre de 2026</w:t>
             </w:r>
           </w:p>
         </w:tc>
       </w:tr>
       <w:tr>
+        <w:trPr>
+          <w:cantSplit/>
+        </w:trPr>
         <w:tc>
           <w:tcPr>
             <w:tcW w:type="dxa" w:w="2551"/>
@@ -276,6 +372,7 @@
     </w:p>
     <w:p>
       <w:pPr>
+        <w:keepNext/>
         <w:jc w:val="both"/>
       </w:pPr>
       <w:r>
@@ -311,22 +408,25 @@
         <w:rPr>
           <w:b/>
         </w:rPr>
-        <w:t>Responsable principal del caso según Git:</w:t>
+        <w:t>Responsable principal del caso:</w:t>
       </w:r>
       <w:r>
         <w:rPr>
           <w:b w:val="0"/>
         </w:rPr>
-        <w:t xml:space="preserve"> André Guido (pendiente de confirmar por el grupo).</w:t>
+        <w:t xml:space="preserve"> André Marcel Guido Castrillo.</w:t>
       </w:r>
     </w:p>
     <w:p>
+      <w:pPr>
+        <w:keepNext/>
+      </w:pPr>
       <w:r>
         <w:rPr>
           <w:b/>
           <w:sz w:val="19"/>
         </w:rPr>
-        <w:t>Tabla 1. Integrantes del grupo</w:t>
+        <w:t>Tabla 1. Integrantes del grupo 3</w:t>
       </w:r>
     </w:p>
     <w:tbl>
@@ -337,16 +437,23 @@
         <w:tblLook w:firstColumn="1" w:firstRow="1" w:lastColumn="0" w:lastRow="0" w:noHBand="0" w:noVBand="1" w:val="04A0"/>
       </w:tblPr>
       <w:tblGrid>
-        <w:gridCol w:w="4703"/>
-        <w:gridCol w:w="4703"/>
+        <w:gridCol w:w="3135"/>
+        <w:gridCol w:w="3135"/>
+        <w:gridCol w:w="3135"/>
       </w:tblGrid>
       <w:tr>
+        <w:trPr>
+          <w:cantSplit/>
+        </w:trPr>
         <w:tc>
           <w:tcPr>
-            <w:tcW w:type="dxa" w:w="4535"/>
+            <w:tcW w:type="dxa" w:w="2721"/>
             <w:shd w:val="clear" w:color="auto" w:fill="1F3A5F"/>
           </w:tcPr>
           <w:p>
+            <w:pPr>
+              <w:keepNext/>
+            </w:pPr>
             <w:r/>
             <w:r>
               <w:rPr>
@@ -360,10 +467,13 @@
         </w:tc>
         <w:tc>
           <w:tcPr>
-            <w:tcW w:type="dxa" w:w="4535"/>
+            <w:tcW w:type="dxa" w:w="1928"/>
             <w:shd w:val="clear" w:color="auto" w:fill="1F3A5F"/>
           </w:tcPr>
           <w:p>
+            <w:pPr>
+              <w:keepNext/>
+            </w:pPr>
             <w:r/>
             <w:r>
               <w:rPr>
@@ -371,15 +481,220 @@
                 <w:color w:val="FFFFFF"/>
                 <w:sz w:val="19"/>
               </w:rPr>
-              <w:t>Usuario o autor en Git</w:t>
+              <w:t>Autor en Git</w:t>
+            </w:r>
+          </w:p>
+        </w:tc>
+        <w:tc>
+          <w:tcPr>
+            <w:tcW w:type="dxa" w:w="4422"/>
+            <w:shd w:val="clear" w:color="auto" w:fill="1F3A5F"/>
+          </w:tcPr>
+          <w:p>
+            <w:pPr>
+              <w:keepNext/>
+            </w:pPr>
+            <w:r/>
+            <w:r>
+              <w:rPr>
+                <w:b/>
+                <w:color w:val="FFFFFF"/>
+                <w:sz w:val="19"/>
+              </w:rPr>
+              <w:t>Responsabilidad principal</w:t>
             </w:r>
           </w:p>
         </w:tc>
       </w:tr>
       <w:tr>
+        <w:trPr>
+          <w:cantSplit/>
+        </w:trPr>
         <w:tc>
           <w:tcPr>
-            <w:tcW w:type="dxa" w:w="4535"/>
+            <w:tcW w:type="dxa" w:w="2721"/>
+          </w:tcPr>
+          <w:p>
+            <w:pPr>
+              <w:keepNext/>
+            </w:pPr>
+            <w:r/>
+            <w:r>
+              <w:rPr>
+                <w:sz w:val="19"/>
+              </w:rPr>
+              <w:t>Víctor Mateo Alcocer López</w:t>
+            </w:r>
+          </w:p>
+        </w:tc>
+        <w:tc>
+          <w:tcPr>
+            <w:tcW w:type="dxa" w:w="1928"/>
+          </w:tcPr>
+          <w:p>
+            <w:pPr>
+              <w:keepNext/>
+            </w:pPr>
+            <w:r/>
+            <w:r>
+              <w:rPr>
+                <w:sz w:val="19"/>
+              </w:rPr>
+              <w:t>ValcocerLopez</w:t>
+            </w:r>
+          </w:p>
+        </w:tc>
+        <w:tc>
+          <w:tcPr>
+            <w:tcW w:type="dxa" w:w="4422"/>
+          </w:tcPr>
+          <w:p>
+            <w:pPr>
+              <w:keepNext/>
+            </w:pPr>
+            <w:r/>
+            <w:r>
+              <w:rPr>
+                <w:sz w:val="19"/>
+              </w:rPr>
+              <w:t>Estructura del proyecto, configuración Maven, menú principal y correcciones de integración.</w:t>
+            </w:r>
+          </w:p>
+        </w:tc>
+      </w:tr>
+      <w:tr>
+        <w:trPr>
+          <w:cantSplit/>
+        </w:trPr>
+        <w:tc>
+          <w:tcPr>
+            <w:tcW w:type="dxa" w:w="2721"/>
+          </w:tcPr>
+          <w:p>
+            <w:pPr>
+              <w:keepNext/>
+            </w:pPr>
+            <w:r/>
+            <w:r>
+              <w:rPr>
+                <w:sz w:val="19"/>
+              </w:rPr>
+              <w:t>Moisés Abraham Valle Alonso</w:t>
+            </w:r>
+          </w:p>
+        </w:tc>
+        <w:tc>
+          <w:tcPr>
+            <w:tcW w:type="dxa" w:w="1928"/>
+          </w:tcPr>
+          <w:p>
+            <w:pPr>
+              <w:keepNext/>
+            </w:pPr>
+            <w:r/>
+            <w:r>
+              <w:rPr>
+                <w:sz w:val="19"/>
+              </w:rPr>
+              <w:t>Argonauta0</w:t>
+            </w:r>
+          </w:p>
+        </w:tc>
+        <w:tc>
+          <w:tcPr>
+            <w:tcW w:type="dxa" w:w="4422"/>
+          </w:tcPr>
+          <w:p>
+            <w:pPr>
+              <w:keepNext/>
+            </w:pPr>
+            <w:r/>
+            <w:r>
+              <w:rPr>
+                <w:sz w:val="19"/>
+              </w:rPr>
+              <w:t>Caso 3, Caja de ventas concurrente: vista, controlador y modelos.</w:t>
+            </w:r>
+          </w:p>
+        </w:tc>
+      </w:tr>
+      <w:tr>
+        <w:trPr>
+          <w:cantSplit/>
+        </w:trPr>
+        <w:tc>
+          <w:tcPr>
+            <w:tcW w:type="dxa" w:w="2721"/>
+          </w:tcPr>
+          <w:p>
+            <w:pPr>
+              <w:keepNext/>
+            </w:pPr>
+            <w:r/>
+            <w:r>
+              <w:rPr>
+                <w:sz w:val="19"/>
+              </w:rPr>
+              <w:t>André Marcel Guido Castrillo</w:t>
+            </w:r>
+          </w:p>
+        </w:tc>
+        <w:tc>
+          <w:tcPr>
+            <w:tcW w:type="dxa" w:w="1928"/>
+          </w:tcPr>
+          <w:p>
+            <w:pPr>
+              <w:keepNext/>
+            </w:pPr>
+            <w:r/>
+            <w:r>
+              <w:rPr>
+                <w:sz w:val="19"/>
+              </w:rPr>
+              <w:t>Andre / André Guido</w:t>
+            </w:r>
+          </w:p>
+        </w:tc>
+        <w:tc>
+          <w:tcPr>
+            <w:tcW w:type="dxa" w:w="4422"/>
+          </w:tcPr>
+          <w:p>
+            <w:pPr>
+              <w:keepNext/>
+            </w:pPr>
+            <w:r/>
+            <w:r>
+              <w:rPr>
+                <w:sz w:val="19"/>
+              </w:rPr>
+              <w:t>Caso 1, Reserva concurrente de entradas: lógica, controlador, interfaz y estilos.</w:t>
+            </w:r>
+          </w:p>
+        </w:tc>
+      </w:tr>
+      <w:tr>
+        <w:trPr>
+          <w:cantSplit/>
+        </w:trPr>
+        <w:tc>
+          <w:tcPr>
+            <w:tcW w:type="dxa" w:w="2721"/>
+          </w:tcPr>
+          <w:p>
+            <w:r/>
+            <w:r>
+              <w:rPr>
+                <w:sz w:val="19"/>
+              </w:rPr>
+              <w:t>Erving Josué Miranda Ríos</w:t>
+            </w:r>
+          </w:p>
+        </w:tc>
+        <w:tc>
+          <w:tcPr>
+            <w:tcW w:type="dxa" w:w="1928"/>
           </w:tcPr>
           <w:p>
             <w:r/>
@@ -393,7 +708,7 @@
         </w:tc>
         <w:tc>
           <w:tcPr>
-            <w:tcW w:type="dxa" w:w="4535"/>
+            <w:tcW w:type="dxa" w:w="4422"/>
           </w:tcPr>
           <w:p>
             <w:r/>
@@ -401,92 +716,13 @@
               <w:rPr>
                 <w:sz w:val="19"/>
               </w:rPr>
-              <w:t>Erving Miranda</w:t>
-            </w:r>
-          </w:p>
-        </w:tc>
-      </w:tr>
-      <w:tr>
-        <w:tc>
-          <w:tcPr>
-            <w:tcW w:type="dxa" w:w="4535"/>
-          </w:tcPr>
-          <w:p>
-            <w:r/>
-            <w:r>
-              <w:rPr>
-                <w:b/>
-                <w:color w:val="B03A2E"/>
-                <w:sz w:val="19"/>
-              </w:rPr>
-              <w:t>[Pendiente: nombre completo]</w:t>
-            </w:r>
-          </w:p>
-        </w:tc>
-        <w:tc>
-          <w:tcPr>
-            <w:tcW w:type="dxa" w:w="4535"/>
-          </w:tcPr>
-          <w:p>
-            <w:r/>
-            <w:r>
-              <w:rPr>
-                <w:b/>
-                <w:color w:val="B03A2E"/>
-                <w:sz w:val="19"/>
-              </w:rPr>
-              <w:t>[Pendiente]</w:t>
-            </w:r>
-          </w:p>
-        </w:tc>
-      </w:tr>
-      <w:tr>
-        <w:tc>
-          <w:tcPr>
-            <w:tcW w:type="dxa" w:w="4535"/>
-          </w:tcPr>
-          <w:p>
-            <w:r/>
-            <w:r>
-              <w:rPr>
-                <w:b/>
-                <w:color w:val="B03A2E"/>
-                <w:sz w:val="19"/>
-              </w:rPr>
-              <w:t>[Pendiente: nombre completo]</w:t>
-            </w:r>
-          </w:p>
-        </w:tc>
-        <w:tc>
-          <w:tcPr>
-            <w:tcW w:type="dxa" w:w="4535"/>
-          </w:tcPr>
-          <w:p>
-            <w:r/>
-            <w:r>
-              <w:rPr>
-                <w:b/>
-                <w:color w:val="B03A2E"/>
-                <w:sz w:val="19"/>
-              </w:rPr>
-              <w:t>[Pendiente]</w:t>
+              <w:t>Caso 2, Procesamiento de pedidos con cancelación; integración y pruebas.</w:t>
             </w:r>
           </w:p>
         </w:tc>
       </w:tr>
     </w:tbl>
     <w:p/>
-    <w:p>
-      <w:pPr>
-        <w:jc w:val="both"/>
-      </w:pPr>
-      <w:r>
-        <w:rPr>
-          <w:b w:val="0"/>
-        </w:rPr>
-        <w:t>En el historial del repositorio aparecen cuatro autores: Erving Miranda, Andre / André Guido, ValcocerLopez (Victor Mateo Alcocer López) y Argonauta0. La guía indica grupos de tres integrantes, por lo que la lista oficial debe confirmarse antes de la entrega.</w:t>
-      </w:r>
-    </w:p>
     <w:p>
       <w:pPr>
         <w:pStyle w:val="Heading1"/>
@@ -756,12 +992,16 @@
     <w:p>
       <w:pPr>
         <w:pStyle w:val="Heading1"/>
+        <w:keepNext/>
       </w:pPr>
       <w:r>
         <w:t>4. Resultados esperados y obtenidos</w:t>
       </w:r>
     </w:p>
     <w:p>
+      <w:pPr>
+        <w:keepNext/>
+      </w:pPr>
       <w:r>
         <w:rPr>
           <w:b/>
@@ -788,12 +1028,18 @@
         <w:gridCol w:w="1176"/>
       </w:tblGrid>
       <w:tr>
+        <w:trPr>
+          <w:cantSplit/>
+        </w:trPr>
         <w:tc>
           <w:tcPr>
             <w:tcW w:type="dxa" w:w="1176"/>
             <w:shd w:val="clear" w:color="auto" w:fill="1F3A5F"/>
           </w:tcPr>
           <w:p>
+            <w:pPr>
+              <w:keepNext/>
+            </w:pPr>
             <w:r/>
             <w:r>
               <w:rPr>
@@ -811,6 +1057,9 @@
             <w:shd w:val="clear" w:color="auto" w:fill="1F3A5F"/>
           </w:tcPr>
           <w:p>
+            <w:pPr>
+              <w:keepNext/>
+            </w:pPr>
             <w:r/>
             <w:r>
               <w:rPr>
@@ -828,6 +1077,9 @@
             <w:shd w:val="clear" w:color="auto" w:fill="1F3A5F"/>
           </w:tcPr>
           <w:p>
+            <w:pPr>
+              <w:keepNext/>
+            </w:pPr>
             <w:r/>
             <w:r>
               <w:rPr>
@@ -845,6 +1097,9 @@
             <w:shd w:val="clear" w:color="auto" w:fill="1F3A5F"/>
           </w:tcPr>
           <w:p>
+            <w:pPr>
+              <w:keepNext/>
+            </w:pPr>
             <w:r/>
             <w:r>
               <w:rPr>
@@ -862,6 +1117,9 @@
             <w:shd w:val="clear" w:color="auto" w:fill="1F3A5F"/>
           </w:tcPr>
           <w:p>
+            <w:pPr>
+              <w:keepNext/>
+            </w:pPr>
             <w:r/>
             <w:r>
               <w:rPr>
@@ -879,6 +1137,9 @@
             <w:shd w:val="clear" w:color="auto" w:fill="1F3A5F"/>
           </w:tcPr>
           <w:p>
+            <w:pPr>
+              <w:keepNext/>
+            </w:pPr>
             <w:r/>
             <w:r>
               <w:rPr>
@@ -896,6 +1157,9 @@
             <w:shd w:val="clear" w:color="auto" w:fill="1F3A5F"/>
           </w:tcPr>
           <w:p>
+            <w:pPr>
+              <w:keepNext/>
+            </w:pPr>
             <w:r/>
             <w:r>
               <w:rPr>
@@ -913,6 +1177,9 @@
             <w:shd w:val="clear" w:color="auto" w:fill="1F3A5F"/>
           </w:tcPr>
           <w:p>
+            <w:pPr>
+              <w:keepNext/>
+            </w:pPr>
             <w:r/>
             <w:r>
               <w:rPr>
@@ -926,11 +1193,17 @@
         </w:tc>
       </w:tr>
       <w:tr>
+        <w:trPr>
+          <w:cantSplit/>
+        </w:trPr>
         <w:tc>
           <w:tcPr>
             <w:tcW w:type="dxa" w:w="1176"/>
           </w:tcPr>
           <w:p>
+            <w:pPr>
+              <w:keepNext/>
+            </w:pPr>
             <w:r/>
             <w:r>
               <w:rPr>
@@ -945,6 +1218,9 @@
             <w:tcW w:type="dxa" w:w="1176"/>
           </w:tcPr>
           <w:p>
+            <w:pPr>
+              <w:keepNext/>
+            </w:pPr>
             <w:r/>
             <w:r>
               <w:rPr>
@@ -959,6 +1235,9 @@
             <w:tcW w:type="dxa" w:w="1176"/>
           </w:tcPr>
           <w:p>
+            <w:pPr>
+              <w:keepNext/>
+            </w:pPr>
             <w:r/>
             <w:r>
               <w:rPr>
@@ -973,6 +1252,9 @@
             <w:tcW w:type="dxa" w:w="1176"/>
           </w:tcPr>
           <w:p>
+            <w:pPr>
+              <w:keepNext/>
+            </w:pPr>
             <w:r/>
             <w:r>
               <w:rPr>
@@ -987,6 +1269,9 @@
             <w:tcW w:type="dxa" w:w="1176"/>
           </w:tcPr>
           <w:p>
+            <w:pPr>
+              <w:keepNext/>
+            </w:pPr>
             <w:r/>
             <w:r>
               <w:rPr>
@@ -1001,6 +1286,9 @@
             <w:tcW w:type="dxa" w:w="1176"/>
           </w:tcPr>
           <w:p>
+            <w:pPr>
+              <w:keepNext/>
+            </w:pPr>
             <w:r/>
             <w:r>
               <w:rPr>
@@ -1015,6 +1303,9 @@
             <w:tcW w:type="dxa" w:w="1176"/>
           </w:tcPr>
           <w:p>
+            <w:pPr>
+              <w:keepNext/>
+            </w:pPr>
             <w:r/>
             <w:r>
               <w:rPr>
@@ -1029,6 +1320,9 @@
             <w:tcW w:type="dxa" w:w="1176"/>
           </w:tcPr>
           <w:p>
+            <w:pPr>
+              <w:keepNext/>
+            </w:pPr>
             <w:r/>
             <w:r>
               <w:rPr>
@@ -1040,11 +1334,17 @@
         </w:tc>
       </w:tr>
       <w:tr>
+        <w:trPr>
+          <w:cantSplit/>
+        </w:trPr>
         <w:tc>
           <w:tcPr>
             <w:tcW w:type="dxa" w:w="1176"/>
           </w:tcPr>
           <w:p>
+            <w:pPr>
+              <w:keepNext/>
+            </w:pPr>
             <w:r/>
             <w:r>
               <w:rPr>
@@ -1059,6 +1359,9 @@
             <w:tcW w:type="dxa" w:w="1176"/>
           </w:tcPr>
           <w:p>
+            <w:pPr>
+              <w:keepNext/>
+            </w:pPr>
             <w:r/>
             <w:r>
               <w:rPr>
@@ -1073,6 +1376,9 @@
             <w:tcW w:type="dxa" w:w="1176"/>
           </w:tcPr>
           <w:p>
+            <w:pPr>
+              <w:keepNext/>
+            </w:pPr>
             <w:r/>
             <w:r>
               <w:rPr>
@@ -1087,6 +1393,9 @@
             <w:tcW w:type="dxa" w:w="1176"/>
           </w:tcPr>
           <w:p>
+            <w:pPr>
+              <w:keepNext/>
+            </w:pPr>
             <w:r/>
             <w:r>
               <w:rPr>
@@ -1101,6 +1410,9 @@
             <w:tcW w:type="dxa" w:w="1176"/>
           </w:tcPr>
           <w:p>
+            <w:pPr>
+              <w:keepNext/>
+            </w:pPr>
             <w:r/>
             <w:r>
               <w:rPr>
@@ -1115,6 +1427,9 @@
             <w:tcW w:type="dxa" w:w="1176"/>
           </w:tcPr>
           <w:p>
+            <w:pPr>
+              <w:keepNext/>
+            </w:pPr>
             <w:r/>
             <w:r>
               <w:rPr>
@@ -1129,6 +1444,9 @@
             <w:tcW w:type="dxa" w:w="1176"/>
           </w:tcPr>
           <w:p>
+            <w:pPr>
+              <w:keepNext/>
+            </w:pPr>
             <w:r/>
             <w:r>
               <w:rPr>
@@ -1143,6 +1461,9 @@
             <w:tcW w:type="dxa" w:w="1176"/>
           </w:tcPr>
           <w:p>
+            <w:pPr>
+              <w:keepNext/>
+            </w:pPr>
             <w:r/>
             <w:r>
               <w:rPr>
@@ -1154,11 +1475,17 @@
         </w:tc>
       </w:tr>
       <w:tr>
+        <w:trPr>
+          <w:cantSplit/>
+        </w:trPr>
         <w:tc>
           <w:tcPr>
             <w:tcW w:type="dxa" w:w="1176"/>
           </w:tcPr>
           <w:p>
+            <w:pPr>
+              <w:keepNext/>
+            </w:pPr>
             <w:r/>
             <w:r>
               <w:rPr>
@@ -1173,6 +1500,9 @@
             <w:tcW w:type="dxa" w:w="1176"/>
           </w:tcPr>
           <w:p>
+            <w:pPr>
+              <w:keepNext/>
+            </w:pPr>
             <w:r/>
             <w:r>
               <w:rPr>
@@ -1187,6 +1517,9 @@
             <w:tcW w:type="dxa" w:w="1176"/>
           </w:tcPr>
           <w:p>
+            <w:pPr>
+              <w:keepNext/>
+            </w:pPr>
             <w:r/>
             <w:r>
               <w:rPr>
@@ -1201,6 +1534,9 @@
             <w:tcW w:type="dxa" w:w="1176"/>
           </w:tcPr>
           <w:p>
+            <w:pPr>
+              <w:keepNext/>
+            </w:pPr>
             <w:r/>
             <w:r>
               <w:rPr>
@@ -1215,6 +1551,9 @@
             <w:tcW w:type="dxa" w:w="1176"/>
           </w:tcPr>
           <w:p>
+            <w:pPr>
+              <w:keepNext/>
+            </w:pPr>
             <w:r/>
             <w:r>
               <w:rPr>
@@ -1229,6 +1568,9 @@
             <w:tcW w:type="dxa" w:w="1176"/>
           </w:tcPr>
           <w:p>
+            <w:pPr>
+              <w:keepNext/>
+            </w:pPr>
             <w:r/>
             <w:r>
               <w:rPr>
@@ -1243,6 +1585,9 @@
             <w:tcW w:type="dxa" w:w="1176"/>
           </w:tcPr>
           <w:p>
+            <w:pPr>
+              <w:keepNext/>
+            </w:pPr>
             <w:r/>
             <w:r>
               <w:rPr>
@@ -1257,6 +1602,9 @@
             <w:tcW w:type="dxa" w:w="1176"/>
           </w:tcPr>
           <w:p>
+            <w:pPr>
+              <w:keepNext/>
+            </w:pPr>
             <w:r/>
             <w:r>
               <w:rPr>
@@ -1268,11 +1616,17 @@
         </w:tc>
       </w:tr>
       <w:tr>
+        <w:trPr>
+          <w:cantSplit/>
+        </w:trPr>
         <w:tc>
           <w:tcPr>
             <w:tcW w:type="dxa" w:w="1176"/>
           </w:tcPr>
           <w:p>
+            <w:pPr>
+              <w:keepNext/>
+            </w:pPr>
             <w:r/>
             <w:r>
               <w:rPr>
@@ -1287,6 +1641,9 @@
             <w:tcW w:type="dxa" w:w="1176"/>
           </w:tcPr>
           <w:p>
+            <w:pPr>
+              <w:keepNext/>
+            </w:pPr>
             <w:r/>
             <w:r>
               <w:rPr>
@@ -1301,6 +1658,9 @@
             <w:tcW w:type="dxa" w:w="1176"/>
           </w:tcPr>
           <w:p>
+            <w:pPr>
+              <w:keepNext/>
+            </w:pPr>
             <w:r/>
             <w:r>
               <w:rPr>
@@ -1315,6 +1675,9 @@
             <w:tcW w:type="dxa" w:w="1176"/>
           </w:tcPr>
           <w:p>
+            <w:pPr>
+              <w:keepNext/>
+            </w:pPr>
             <w:r/>
             <w:r>
               <w:rPr>
@@ -1329,6 +1692,9 @@
             <w:tcW w:type="dxa" w:w="1176"/>
           </w:tcPr>
           <w:p>
+            <w:pPr>
+              <w:keepNext/>
+            </w:pPr>
             <w:r/>
             <w:r>
               <w:rPr>
@@ -1343,6 +1709,9 @@
             <w:tcW w:type="dxa" w:w="1176"/>
           </w:tcPr>
           <w:p>
+            <w:pPr>
+              <w:keepNext/>
+            </w:pPr>
             <w:r/>
             <w:r>
               <w:rPr>
@@ -1357,6 +1726,9 @@
             <w:tcW w:type="dxa" w:w="1176"/>
           </w:tcPr>
           <w:p>
+            <w:pPr>
+              <w:keepNext/>
+            </w:pPr>
             <w:r/>
             <w:r>
               <w:rPr>
@@ -1371,6 +1743,9 @@
             <w:tcW w:type="dxa" w:w="1176"/>
           </w:tcPr>
           <w:p>
+            <w:pPr>
+              <w:keepNext/>
+            </w:pPr>
             <w:r/>
             <w:r>
               <w:rPr>
@@ -1382,6 +1757,9 @@
         </w:tc>
       </w:tr>
       <w:tr>
+        <w:trPr>
+          <w:cantSplit/>
+        </w:trPr>
         <w:tc>
           <w:tcPr>
             <w:tcW w:type="dxa" w:w="1176"/>
@@ -1499,6 +1877,7 @@
     <w:p/>
     <w:p>
       <w:pPr>
+        <w:keepNext/>
         <w:jc w:val="both"/>
       </w:pPr>
       <w:r>
@@ -1509,6 +1888,9 @@
       </w:r>
     </w:p>
     <w:p>
+      <w:pPr>
+        <w:keepNext/>
+      </w:pPr>
       <w:r>
         <w:rPr>
           <w:b/>
@@ -1531,12 +1913,18 @@
         <w:gridCol w:w="2351"/>
       </w:tblGrid>
       <w:tr>
+        <w:trPr>
+          <w:cantSplit/>
+        </w:trPr>
         <w:tc>
           <w:tcPr>
             <w:tcW w:type="dxa" w:w="1984"/>
             <w:shd w:val="clear" w:color="auto" w:fill="1F3A5F"/>
           </w:tcPr>
           <w:p>
+            <w:pPr>
+              <w:keepNext/>
+            </w:pPr>
             <w:r/>
             <w:r>
               <w:rPr>
@@ -1554,6 +1942,9 @@
             <w:shd w:val="clear" w:color="auto" w:fill="1F3A5F"/>
           </w:tcPr>
           <w:p>
+            <w:pPr>
+              <w:keepNext/>
+            </w:pPr>
             <w:r/>
             <w:r>
               <w:rPr>
@@ -1571,6 +1962,9 @@
             <w:shd w:val="clear" w:color="auto" w:fill="1F3A5F"/>
           </w:tcPr>
           <w:p>
+            <w:pPr>
+              <w:keepNext/>
+            </w:pPr>
             <w:r/>
             <w:r>
               <w:rPr>
@@ -1588,6 +1982,9 @@
             <w:shd w:val="clear" w:color="auto" w:fill="1F3A5F"/>
           </w:tcPr>
           <w:p>
+            <w:pPr>
+              <w:keepNext/>
+            </w:pPr>
             <w:r/>
             <w:r>
               <w:rPr>
@@ -1601,11 +1998,17 @@
         </w:tc>
       </w:tr>
       <w:tr>
+        <w:trPr>
+          <w:cantSplit/>
+        </w:trPr>
         <w:tc>
           <w:tcPr>
             <w:tcW w:type="dxa" w:w="1984"/>
           </w:tcPr>
           <w:p>
+            <w:pPr>
+              <w:keepNext/>
+            </w:pPr>
             <w:r/>
             <w:r>
               <w:rPr>
@@ -1620,6 +2023,9 @@
             <w:tcW w:type="dxa" w:w="2551"/>
           </w:tcPr>
           <w:p>
+            <w:pPr>
+              <w:keepNext/>
+            </w:pPr>
             <w:r/>
             <w:r>
               <w:rPr>
@@ -1634,6 +2040,9 @@
             <w:tcW w:type="dxa" w:w="3402"/>
           </w:tcPr>
           <w:p>
+            <w:pPr>
+              <w:keepNext/>
+            </w:pPr>
             <w:r/>
             <w:r>
               <w:rPr>
@@ -1648,6 +2057,9 @@
             <w:tcW w:type="dxa" w:w="1134"/>
           </w:tcPr>
           <w:p>
+            <w:pPr>
+              <w:keepNext/>
+            </w:pPr>
             <w:r/>
             <w:r>
               <w:rPr>
@@ -1659,11 +2071,17 @@
         </w:tc>
       </w:tr>
       <w:tr>
+        <w:trPr>
+          <w:cantSplit/>
+        </w:trPr>
         <w:tc>
           <w:tcPr>
             <w:tcW w:type="dxa" w:w="1984"/>
           </w:tcPr>
           <w:p>
+            <w:pPr>
+              <w:keepNext/>
+            </w:pPr>
             <w:r/>
             <w:r>
               <w:rPr>
@@ -1678,6 +2096,9 @@
             <w:tcW w:type="dxa" w:w="2551"/>
           </w:tcPr>
           <w:p>
+            <w:pPr>
+              <w:keepNext/>
+            </w:pPr>
             <w:r/>
             <w:r>
               <w:rPr>
@@ -1692,6 +2113,9 @@
             <w:tcW w:type="dxa" w:w="3402"/>
           </w:tcPr>
           <w:p>
+            <w:pPr>
+              <w:keepNext/>
+            </w:pPr>
             <w:r/>
             <w:r>
               <w:rPr>
@@ -1706,6 +2130,9 @@
             <w:tcW w:type="dxa" w:w="1134"/>
           </w:tcPr>
           <w:p>
+            <w:pPr>
+              <w:keepNext/>
+            </w:pPr>
             <w:r/>
             <w:r>
               <w:rPr>
@@ -1717,11 +2144,17 @@
         </w:tc>
       </w:tr>
       <w:tr>
+        <w:trPr>
+          <w:cantSplit/>
+        </w:trPr>
         <w:tc>
           <w:tcPr>
             <w:tcW w:type="dxa" w:w="1984"/>
           </w:tcPr>
           <w:p>
+            <w:pPr>
+              <w:keepNext/>
+            </w:pPr>
             <w:r/>
             <w:r>
               <w:rPr>
@@ -1736,6 +2169,9 @@
             <w:tcW w:type="dxa" w:w="2551"/>
           </w:tcPr>
           <w:p>
+            <w:pPr>
+              <w:keepNext/>
+            </w:pPr>
             <w:r/>
             <w:r>
               <w:rPr>
@@ -1750,6 +2186,9 @@
             <w:tcW w:type="dxa" w:w="3402"/>
           </w:tcPr>
           <w:p>
+            <w:pPr>
+              <w:keepNext/>
+            </w:pPr>
             <w:r/>
             <w:r>
               <w:rPr>
@@ -1764,6 +2203,9 @@
             <w:tcW w:type="dxa" w:w="1134"/>
           </w:tcPr>
           <w:p>
+            <w:pPr>
+              <w:keepNext/>
+            </w:pPr>
             <w:r/>
             <w:r>
               <w:rPr>
@@ -1775,11 +2217,17 @@
         </w:tc>
       </w:tr>
       <w:tr>
+        <w:trPr>
+          <w:cantSplit/>
+        </w:trPr>
         <w:tc>
           <w:tcPr>
             <w:tcW w:type="dxa" w:w="1984"/>
           </w:tcPr>
           <w:p>
+            <w:pPr>
+              <w:keepNext/>
+            </w:pPr>
             <w:r/>
             <w:r>
               <w:rPr>
@@ -1794,6 +2242,9 @@
             <w:tcW w:type="dxa" w:w="2551"/>
           </w:tcPr>
           <w:p>
+            <w:pPr>
+              <w:keepNext/>
+            </w:pPr>
             <w:r/>
             <w:r>
               <w:rPr>
@@ -1808,6 +2259,9 @@
             <w:tcW w:type="dxa" w:w="3402"/>
           </w:tcPr>
           <w:p>
+            <w:pPr>
+              <w:keepNext/>
+            </w:pPr>
             <w:r/>
             <w:r>
               <w:rPr>
@@ -1822,6 +2276,9 @@
             <w:tcW w:type="dxa" w:w="1134"/>
           </w:tcPr>
           <w:p>
+            <w:pPr>
+              <w:keepNext/>
+            </w:pPr>
             <w:r/>
             <w:r>
               <w:rPr>
@@ -1833,6 +2290,9 @@
         </w:tc>
       </w:tr>
       <w:tr>
+        <w:trPr>
+          <w:cantSplit/>
+        </w:trPr>
         <w:tc>
           <w:tcPr>
             <w:tcW w:type="dxa" w:w="1984"/>
@@ -2393,16 +2853,20 @@
     </w:p>
     <w:p>
       <w:pPr>
+        <w:keepNext/>
         <w:jc w:val="both"/>
       </w:pPr>
       <w:r>
         <w:rPr>
           <w:b w:val="0"/>
         </w:rPr>
-        <w:t>La siguiente tabla resume los aportes que pueden comprobarse en el historial de Git del repositorio. La distribución oficial de responsabilidades (interfaz, lógica concurrente, pruebas y documentación) debe ser confirmada por el grupo.</w:t>
+        <w:t>La primera tabla resume los aportes que pueden comprobarse en el historial de Git del repositorio. La segunda distingue al responsable principal de este caso de las contribuciones generales al proyecto.</w:t>
       </w:r>
     </w:p>
     <w:p>
+      <w:pPr>
+        <w:keepNext/>
+      </w:pPr>
       <w:r>
         <w:rPr>
           <w:b/>
@@ -2423,12 +2887,18 @@
         <w:gridCol w:w="4703"/>
       </w:tblGrid>
       <w:tr>
+        <w:trPr>
+          <w:cantSplit/>
+        </w:trPr>
         <w:tc>
           <w:tcPr>
             <w:tcW w:type="dxa" w:w="2268"/>
             <w:shd w:val="clear" w:color="auto" w:fill="1F3A5F"/>
           </w:tcPr>
           <w:p>
+            <w:pPr>
+              <w:keepNext/>
+            </w:pPr>
             <w:r/>
             <w:r>
               <w:rPr>
@@ -2446,6 +2916,9 @@
             <w:shd w:val="clear" w:color="auto" w:fill="1F3A5F"/>
           </w:tcPr>
           <w:p>
+            <w:pPr>
+              <w:keepNext/>
+            </w:pPr>
             <w:r/>
             <w:r>
               <w:rPr>
@@ -2459,6 +2932,126 @@
         </w:tc>
       </w:tr>
       <w:tr>
+        <w:trPr>
+          <w:cantSplit/>
+        </w:trPr>
+        <w:tc>
+          <w:tcPr>
+            <w:tcW w:type="dxa" w:w="2268"/>
+          </w:tcPr>
+          <w:p>
+            <w:pPr>
+              <w:keepNext/>
+            </w:pPr>
+            <w:r/>
+            <w:r>
+              <w:rPr>
+                <w:sz w:val="19"/>
+              </w:rPr>
+              <w:t>Víctor Mateo Alcocer López (ValcocerLopez)</w:t>
+            </w:r>
+          </w:p>
+        </w:tc>
+        <w:tc>
+          <w:tcPr>
+            <w:tcW w:type="dxa" w:w="6803"/>
+          </w:tcPr>
+          <w:p>
+            <w:pPr>
+              <w:keepNext/>
+            </w:pPr>
+            <w:r/>
+            <w:r>
+              <w:rPr>
+                <w:sz w:val="19"/>
+              </w:rPr>
+              <w:t>Estructura inicial del monorepo, menú principal, corrección de los pom.xml y del controlador de la caja; fusión de la solicitud #1 (Reserva_Concurrente).</w:t>
+            </w:r>
+          </w:p>
+        </w:tc>
+      </w:tr>
+      <w:tr>
+        <w:trPr>
+          <w:cantSplit/>
+        </w:trPr>
+        <w:tc>
+          <w:tcPr>
+            <w:tcW w:type="dxa" w:w="2268"/>
+          </w:tcPr>
+          <w:p>
+            <w:pPr>
+              <w:keepNext/>
+            </w:pPr>
+            <w:r/>
+            <w:r>
+              <w:rPr>
+                <w:sz w:val="19"/>
+              </w:rPr>
+              <w:t>André Marcel Guido Castrillo (Andre)</w:t>
+            </w:r>
+          </w:p>
+        </w:tc>
+        <w:tc>
+          <w:tcPr>
+            <w:tcW w:type="dxa" w:w="6803"/>
+          </w:tcPr>
+          <w:p>
+            <w:pPr>
+              <w:keepNext/>
+            </w:pPr>
+            <w:r/>
+            <w:r>
+              <w:rPr>
+                <w:sz w:val="19"/>
+              </w:rPr>
+              <w:t>Caso 1: vista reserva-view.fxml, hojas de estilo, clases Inventario, AgenteReserva y ReservaController; fusión de la solicitud #2 (caja_pedidos).</w:t>
+            </w:r>
+          </w:p>
+        </w:tc>
+      </w:tr>
+      <w:tr>
+        <w:trPr>
+          <w:cantSplit/>
+        </w:trPr>
+        <w:tc>
+          <w:tcPr>
+            <w:tcW w:type="dxa" w:w="2268"/>
+          </w:tcPr>
+          <w:p>
+            <w:pPr>
+              <w:keepNext/>
+            </w:pPr>
+            <w:r/>
+            <w:r>
+              <w:rPr>
+                <w:sz w:val="19"/>
+              </w:rPr>
+              <w:t>Moisés Abraham Valle Alonso (Argonauta0)</w:t>
+            </w:r>
+          </w:p>
+        </w:tc>
+        <w:tc>
+          <w:tcPr>
+            <w:tcW w:type="dxa" w:w="6803"/>
+          </w:tcPr>
+          <w:p>
+            <w:pPr>
+              <w:keepNext/>
+            </w:pPr>
+            <w:r/>
+            <w:r>
+              <w:rPr>
+                <w:sz w:val="19"/>
+              </w:rPr>
+              <w:t>Caso 3: vista caja-ventas-view.fxml, CajaVentasController, CajaVentasApplication, modelos CajaCompartida y ProcesadorVentasTask, Launcher y comentarios.</w:t>
+            </w:r>
+          </w:p>
+        </w:tc>
+      </w:tr>
+      <w:tr>
+        <w:trPr>
+          <w:cantSplit/>
+        </w:trPr>
         <w:tc>
           <w:tcPr>
             <w:tcW w:type="dxa" w:w="2268"/>
@@ -2469,7 +3062,7 @@
               <w:rPr>
                 <w:sz w:val="19"/>
               </w:rPr>
-              <w:t>ValcocerLopez</w:t>
+              <w:t>Erving Josué Miranda Ríos (Erving Miranda)</w:t>
             </w:r>
           </w:p>
         </w:tc>
@@ -2483,97 +3076,7 @@
               <w:rPr>
                 <w:sz w:val="19"/>
               </w:rPr>
-              <w:t>Estructura inicial del monorepo, menú principal, corrección de los pom.xml y del controlador de la caja; fusión de la solicitud #1 (Reserva_Concurrente).</w:t>
-            </w:r>
-          </w:p>
-        </w:tc>
-      </w:tr>
-      <w:tr>
-        <w:tc>
-          <w:tcPr>
-            <w:tcW w:type="dxa" w:w="2268"/>
-          </w:tcPr>
-          <w:p>
-            <w:r/>
-            <w:r>
-              <w:rPr>
-                <w:sz w:val="19"/>
-              </w:rPr>
-              <w:t>Andre / André Guido</w:t>
-            </w:r>
-          </w:p>
-        </w:tc>
-        <w:tc>
-          <w:tcPr>
-            <w:tcW w:type="dxa" w:w="6803"/>
-          </w:tcPr>
-          <w:p>
-            <w:r/>
-            <w:r>
-              <w:rPr>
-                <w:sz w:val="19"/>
-              </w:rPr>
-              <w:t>Caso 1: vista reserva-view.fxml, hojas de estilo, clases Inventario, AgenteReserva y ReservaController; fusión de la solicitud #2 (caja_pedidos).</w:t>
-            </w:r>
-          </w:p>
-        </w:tc>
-      </w:tr>
-      <w:tr>
-        <w:tc>
-          <w:tcPr>
-            <w:tcW w:type="dxa" w:w="2268"/>
-          </w:tcPr>
-          <w:p>
-            <w:r/>
-            <w:r>
-              <w:rPr>
-                <w:sz w:val="19"/>
-              </w:rPr>
-              <w:t>Argonauta0</w:t>
-            </w:r>
-          </w:p>
-        </w:tc>
-        <w:tc>
-          <w:tcPr>
-            <w:tcW w:type="dxa" w:w="6803"/>
-          </w:tcPr>
-          <w:p>
-            <w:r/>
-            <w:r>
-              <w:rPr>
-                <w:sz w:val="19"/>
-              </w:rPr>
-              <w:t>Caso 3: vista caja-ventas-view.fxml, CajaVentasController, CajaVentasApplication, modelos CajaCompartida y ProcesadorVentasTask, Launcher y comentarios.</w:t>
-            </w:r>
-          </w:p>
-        </w:tc>
-      </w:tr>
-      <w:tr>
-        <w:tc>
-          <w:tcPr>
-            <w:tcW w:type="dxa" w:w="2268"/>
-          </w:tcPr>
-          <w:p>
-            <w:r/>
-            <w:r>
-              <w:rPr>
-                <w:sz w:val="19"/>
-              </w:rPr>
-              <w:t>Erving Miranda</w:t>
-            </w:r>
-          </w:p>
-        </w:tc>
-        <w:tc>
-          <w:tcPr>
-            <w:tcW w:type="dxa" w:w="6803"/>
-          </w:tcPr>
-          <w:p>
-            <w:r/>
-            <w:r>
-              <w:rPr>
-                <w:sz w:val="19"/>
-              </w:rPr>
-              <w:t>Caso 2: PedidosController, ProcesadorPedidos, PedidosApplication, vista pedidos-view.fxml y pruebas JUnit; revisión final del conjunto, README e informes.</w:t>
+              <w:t>Caso 2: PedidosController, ProcesadorPedidos, PedidosApplication, vista pedidos-view.fxml y pruebas JUnit; integración con master, revisión final del conjunto, README e informes.</w:t>
             </w:r>
           </w:p>
         </w:tc>
@@ -2581,12 +3084,15 @@
     </w:tbl>
     <w:p/>
     <w:p>
+      <w:pPr>
+        <w:keepNext/>
+      </w:pPr>
       <w:r>
         <w:rPr>
           <w:b/>
           <w:sz w:val="19"/>
         </w:rPr>
-        <w:t>Tabla 5. Responsabilidades declaradas por el grupo</w:t>
+        <w:t>Tabla 5. Distribución de responsabilidades en este caso</w:t>
       </w:r>
     </w:p>
     <w:tbl>
@@ -2597,16 +3103,23 @@
         <w:tblLook w:firstColumn="1" w:firstRow="1" w:lastColumn="0" w:lastRow="0" w:noHBand="0" w:noVBand="1" w:val="04A0"/>
       </w:tblPr>
       <w:tblGrid>
-        <w:gridCol w:w="4703"/>
-        <w:gridCol w:w="4703"/>
+        <w:gridCol w:w="3135"/>
+        <w:gridCol w:w="3135"/>
+        <w:gridCol w:w="3135"/>
       </w:tblGrid>
       <w:tr>
+        <w:trPr>
+          <w:cantSplit/>
+        </w:trPr>
         <w:tc>
           <w:tcPr>
-            <w:tcW w:type="dxa" w:w="2835"/>
+            <w:tcW w:type="dxa" w:w="2551"/>
             <w:shd w:val="clear" w:color="auto" w:fill="1F3A5F"/>
           </w:tcPr>
           <w:p>
+            <w:pPr>
+              <w:keepNext/>
+            </w:pPr>
             <w:r/>
             <w:r>
               <w:rPr>
@@ -2620,10 +3133,13 @@
         </w:tc>
         <w:tc>
           <w:tcPr>
-            <w:tcW w:type="dxa" w:w="6236"/>
+            <w:tcW w:type="dxa" w:w="1984"/>
             <w:shd w:val="clear" w:color="auto" w:fill="1F3A5F"/>
           </w:tcPr>
           <w:p>
+            <w:pPr>
+              <w:keepNext/>
+            </w:pPr>
             <w:r/>
             <w:r>
               <w:rPr>
@@ -2631,15 +3147,206 @@
                 <w:color w:val="FFFFFF"/>
                 <w:sz w:val="19"/>
               </w:rPr>
-              <w:t>Responsabilidad en este caso</w:t>
+              <w:t>Rol</w:t>
+            </w:r>
+          </w:p>
+        </w:tc>
+        <w:tc>
+          <w:tcPr>
+            <w:tcW w:type="dxa" w:w="4535"/>
+            <w:shd w:val="clear" w:color="auto" w:fill="1F3A5F"/>
+          </w:tcPr>
+          <w:p>
+            <w:pPr>
+              <w:keepNext/>
+            </w:pPr>
+            <w:r/>
+            <w:r>
+              <w:rPr>
+                <w:b/>
+                <w:color w:val="FFFFFF"/>
+                <w:sz w:val="19"/>
+              </w:rPr>
+              <w:t>Actividades</w:t>
             </w:r>
           </w:p>
         </w:tc>
       </w:tr>
       <w:tr>
+        <w:trPr>
+          <w:cantSplit/>
+        </w:trPr>
         <w:tc>
           <w:tcPr>
-            <w:tcW w:type="dxa" w:w="2835"/>
+            <w:tcW w:type="dxa" w:w="2551"/>
+          </w:tcPr>
+          <w:p>
+            <w:pPr>
+              <w:keepNext/>
+            </w:pPr>
+            <w:r/>
+            <w:r>
+              <w:rPr>
+                <w:sz w:val="19"/>
+              </w:rPr>
+              <w:t>André Marcel Guido Castrillo</w:t>
+            </w:r>
+          </w:p>
+        </w:tc>
+        <w:tc>
+          <w:tcPr>
+            <w:tcW w:type="dxa" w:w="1984"/>
+          </w:tcPr>
+          <w:p>
+            <w:pPr>
+              <w:keepNext/>
+            </w:pPr>
+            <w:r/>
+            <w:r>
+              <w:rPr>
+                <w:sz w:val="19"/>
+              </w:rPr>
+              <w:t>Responsable principal del caso</w:t>
+            </w:r>
+          </w:p>
+        </w:tc>
+        <w:tc>
+          <w:tcPr>
+            <w:tcW w:type="dxa" w:w="4535"/>
+          </w:tcPr>
+          <w:p>
+            <w:pPr>
+              <w:keepNext/>
+            </w:pPr>
+            <w:r/>
+            <w:r>
+              <w:rPr>
+                <w:sz w:val="19"/>
+              </w:rPr>
+              <w:t>Lógica (Inventario y AgenteReserva), ReservaController, interfaz reserva-view.fxml y hojas de estilo.</w:t>
+            </w:r>
+          </w:p>
+        </w:tc>
+      </w:tr>
+      <w:tr>
+        <w:trPr>
+          <w:cantSplit/>
+        </w:trPr>
+        <w:tc>
+          <w:tcPr>
+            <w:tcW w:type="dxa" w:w="2551"/>
+          </w:tcPr>
+          <w:p>
+            <w:pPr>
+              <w:keepNext/>
+            </w:pPr>
+            <w:r/>
+            <w:r>
+              <w:rPr>
+                <w:sz w:val="19"/>
+              </w:rPr>
+              <w:t>Víctor Mateo Alcocer López</w:t>
+            </w:r>
+          </w:p>
+        </w:tc>
+        <w:tc>
+          <w:tcPr>
+            <w:tcW w:type="dxa" w:w="1984"/>
+          </w:tcPr>
+          <w:p>
+            <w:pPr>
+              <w:keepNext/>
+            </w:pPr>
+            <w:r/>
+            <w:r>
+              <w:rPr>
+                <w:sz w:val="19"/>
+              </w:rPr>
+              <w:t>Contribución general al proyecto</w:t>
+            </w:r>
+          </w:p>
+        </w:tc>
+        <w:tc>
+          <w:tcPr>
+            <w:tcW w:type="dxa" w:w="4535"/>
+          </w:tcPr>
+          <w:p>
+            <w:pPr>
+              <w:keepNext/>
+            </w:pPr>
+            <w:r/>
+            <w:r>
+              <w:rPr>
+                <w:sz w:val="19"/>
+              </w:rPr>
+              <w:t>Estructura del proyecto, configuración Maven, menú principal y correcciones de integración.</w:t>
+            </w:r>
+          </w:p>
+        </w:tc>
+      </w:tr>
+      <w:tr>
+        <w:trPr>
+          <w:cantSplit/>
+        </w:trPr>
+        <w:tc>
+          <w:tcPr>
+            <w:tcW w:type="dxa" w:w="2551"/>
+          </w:tcPr>
+          <w:p>
+            <w:pPr>
+              <w:keepNext/>
+            </w:pPr>
+            <w:r/>
+            <w:r>
+              <w:rPr>
+                <w:sz w:val="19"/>
+              </w:rPr>
+              <w:t>Moisés Abraham Valle Alonso</w:t>
+            </w:r>
+          </w:p>
+        </w:tc>
+        <w:tc>
+          <w:tcPr>
+            <w:tcW w:type="dxa" w:w="1984"/>
+          </w:tcPr>
+          <w:p>
+            <w:pPr>
+              <w:keepNext/>
+            </w:pPr>
+            <w:r/>
+            <w:r>
+              <w:rPr>
+                <w:sz w:val="19"/>
+              </w:rPr>
+              <w:t>Contribución general al proyecto</w:t>
+            </w:r>
+          </w:p>
+        </w:tc>
+        <w:tc>
+          <w:tcPr>
+            <w:tcW w:type="dxa" w:w="4535"/>
+          </w:tcPr>
+          <w:p>
+            <w:pPr>
+              <w:keepNext/>
+            </w:pPr>
+            <w:r/>
+            <w:r>
+              <w:rPr>
+                <w:sz w:val="19"/>
+              </w:rPr>
+              <w:t>Desarrollo del caso 3, Caja de ventas concurrente.</w:t>
+            </w:r>
+          </w:p>
+        </w:tc>
+      </w:tr>
+      <w:tr>
+        <w:trPr>
+          <w:cantSplit/>
+        </w:trPr>
+        <w:tc>
+          <w:tcPr>
+            <w:tcW w:type="dxa" w:w="2551"/>
           </w:tcPr>
           <w:p>
             <w:r/>
@@ -2647,31 +3354,13 @@
               <w:rPr>
                 <w:sz w:val="19"/>
               </w:rPr>
-              <w:t>André Guido</w:t>
+              <w:t>Erving Josué Miranda Ríos</w:t>
             </w:r>
           </w:p>
         </w:tc>
         <w:tc>
           <w:tcPr>
-            <w:tcW w:type="dxa" w:w="6236"/>
-          </w:tcPr>
-          <w:p>
-            <w:r/>
-            <w:r>
-              <w:rPr>
-                <w:b/>
-                <w:color w:val="B03A2E"/>
-                <w:sz w:val="19"/>
-              </w:rPr>
-              <w:t>[Pendiente de confirmar] Según Git: vista, estilos, Inventario, AgenteReserva y ReservaController.</w:t>
-            </w:r>
-          </w:p>
-        </w:tc>
-      </w:tr>
-      <w:tr>
-        <w:tc>
-          <w:tcPr>
-            <w:tcW w:type="dxa" w:w="2835"/>
+            <w:tcW w:type="dxa" w:w="1984"/>
           </w:tcPr>
           <w:p>
             <w:r/>
@@ -2679,13 +3368,13 @@
               <w:rPr>
                 <w:sz w:val="19"/>
               </w:rPr>
-              <w:t>Erving Miranda</w:t>
+              <w:t>Contribución general al proyecto</w:t>
             </w:r>
           </w:p>
         </w:tc>
         <w:tc>
           <w:tcPr>
-            <w:tcW w:type="dxa" w:w="6236"/>
+            <w:tcW w:type="dxa" w:w="4535"/>
           </w:tcPr>
           <w:p>
             <w:r/>
@@ -2693,41 +3382,7 @@
               <w:rPr>
                 <w:sz w:val="19"/>
               </w:rPr>
-              <w:t>Revisión del conjunto, pruebas manuales, capturas y redacción de este informe.</w:t>
-            </w:r>
-          </w:p>
-        </w:tc>
-      </w:tr>
-      <w:tr>
-        <w:tc>
-          <w:tcPr>
-            <w:tcW w:type="dxa" w:w="2835"/>
-          </w:tcPr>
-          <w:p>
-            <w:r/>
-            <w:r>
-              <w:rPr>
-                <w:b/>
-                <w:color w:val="B03A2E"/>
-                <w:sz w:val="19"/>
-              </w:rPr>
-              <w:t>[Pendiente]</w:t>
-            </w:r>
-          </w:p>
-        </w:tc>
-        <w:tc>
-          <w:tcPr>
-            <w:tcW w:type="dxa" w:w="6236"/>
-          </w:tcPr>
-          <w:p>
-            <w:r/>
-            <w:r>
-              <w:rPr>
-                <w:b/>
-                <w:color w:val="B03A2E"/>
-                <w:sz w:val="19"/>
-              </w:rPr>
-              <w:t>[Pendiente]</w:t>
+              <w:t>Desarrollo del caso 2; integración, pruebas de los tres casos y documentación.</w:t>
             </w:r>
           </w:p>
         </w:tc>
@@ -2762,6 +3417,21 @@
       </w:r>
     </w:p>
     <w:p>
+      <w:pPr>
+        <w:keepNext/>
+        <w:jc w:val="both"/>
+      </w:pPr>
+      <w:r>
+        <w:rPr>
+          <w:b w:val="0"/>
+        </w:rPr>
+        <w:t>Para ejecutar desde IntelliJ IDEA: abrir la carpeta raíz del repositorio, seleccionar un SDK 21, elegir la configuración «Caso 1 - Reserva concurrente» o «Menu principal» en la barra superior y pulsar Run. Las configuraciones se incluyen en la carpeta .run/ del repositorio.</w:t>
+      </w:r>
+    </w:p>
+    <w:p>
+      <w:pPr>
+        <w:keepNext/>
+      </w:pPr>
       <w:r>
         <w:rPr>
           <w:b/>
@@ -2782,12 +3452,18 @@
         <w:gridCol w:w="4703"/>
       </w:tblGrid>
       <w:tr>
+        <w:trPr>
+          <w:cantSplit/>
+        </w:trPr>
         <w:tc>
           <w:tcPr>
             <w:tcW w:type="dxa" w:w="2835"/>
             <w:shd w:val="clear" w:color="auto" w:fill="1F3A5F"/>
           </w:tcPr>
           <w:p>
+            <w:pPr>
+              <w:keepNext/>
+            </w:pPr>
             <w:r/>
             <w:r>
               <w:rPr>
@@ -2805,6 +3481,9 @@
             <w:shd w:val="clear" w:color="auto" w:fill="1F3A5F"/>
           </w:tcPr>
           <w:p>
+            <w:pPr>
+              <w:keepNext/>
+            </w:pPr>
             <w:r/>
             <w:r>
               <w:rPr>
@@ -2818,11 +3497,17 @@
         </w:tc>
       </w:tr>
       <w:tr>
+        <w:trPr>
+          <w:cantSplit/>
+        </w:trPr>
         <w:tc>
           <w:tcPr>
             <w:tcW w:type="dxa" w:w="2835"/>
           </w:tcPr>
           <w:p>
+            <w:pPr>
+              <w:keepNext/>
+            </w:pPr>
             <w:r/>
             <w:r>
               <w:rPr>
@@ -2837,6 +3522,9 @@
             <w:tcW w:type="dxa" w:w="6236"/>
           </w:tcPr>
           <w:p>
+            <w:pPr>
+              <w:keepNext/>
+            </w:pPr>
             <w:r/>
             <w:r>
               <w:rPr>
@@ -2848,11 +3536,17 @@
         </w:tc>
       </w:tr>
       <w:tr>
+        <w:trPr>
+          <w:cantSplit/>
+        </w:trPr>
         <w:tc>
           <w:tcPr>
             <w:tcW w:type="dxa" w:w="2835"/>
           </w:tcPr>
           <w:p>
+            <w:pPr>
+              <w:keepNext/>
+            </w:pPr>
             <w:r/>
             <w:r>
               <w:rPr>
@@ -2867,22 +3561,31 @@
             <w:tcW w:type="dxa" w:w="6236"/>
           </w:tcPr>
           <w:p>
+            <w:pPr>
+              <w:keepNext/>
+            </w:pPr>
             <w:r/>
             <w:r>
               <w:rPr>
                 <w:sz w:val="19"/>
               </w:rPr>
-              <w:t>fix/revision-entrega (pendiente de integrar a master mediante revisión del grupo)</w:t>
+              <w:t>fix/revision-entrega (solicitud de integración #3 hacia master)</w:t>
             </w:r>
           </w:p>
         </w:tc>
       </w:tr>
       <w:tr>
+        <w:trPr>
+          <w:cantSplit/>
+        </w:trPr>
         <w:tc>
           <w:tcPr>
             <w:tcW w:type="dxa" w:w="2835"/>
           </w:tcPr>
           <w:p>
+            <w:pPr>
+              <w:keepNext/>
+            </w:pPr>
             <w:r/>
             <w:r>
               <w:rPr>
@@ -2897,6 +3600,9 @@
             <w:tcW w:type="dxa" w:w="6236"/>
           </w:tcPr>
           <w:p>
+            <w:pPr>
+              <w:keepNext/>
+            </w:pPr>
             <w:r/>
             <w:r>
               <w:rPr>
@@ -2908,11 +3614,17 @@
         </w:tc>
       </w:tr>
       <w:tr>
+        <w:trPr>
+          <w:cantSplit/>
+        </w:trPr>
         <w:tc>
           <w:tcPr>
             <w:tcW w:type="dxa" w:w="2835"/>
           </w:tcPr>
           <w:p>
+            <w:pPr>
+              <w:keepNext/>
+            </w:pPr>
             <w:r/>
             <w:r>
               <w:rPr>
@@ -2927,6 +3639,9 @@
             <w:tcW w:type="dxa" w:w="6236"/>
           </w:tcPr>
           <w:p>
+            <w:pPr>
+              <w:keepNext/>
+            </w:pPr>
             <w:r/>
             <w:r>
               <w:rPr>
@@ -2938,11 +3653,17 @@
         </w:tc>
       </w:tr>
       <w:tr>
+        <w:trPr>
+          <w:cantSplit/>
+        </w:trPr>
         <w:tc>
           <w:tcPr>
             <w:tcW w:type="dxa" w:w="2835"/>
           </w:tcPr>
           <w:p>
+            <w:pPr>
+              <w:keepNext/>
+            </w:pPr>
             <w:r/>
             <w:r>
               <w:rPr>
@@ -2957,6 +3678,9 @@
             <w:tcW w:type="dxa" w:w="6236"/>
           </w:tcPr>
           <w:p>
+            <w:pPr>
+              <w:keepNext/>
+            </w:pPr>
             <w:r/>
             <w:r>
               <w:rPr>
@@ -2968,11 +3692,17 @@
         </w:tc>
       </w:tr>
       <w:tr>
+        <w:trPr>
+          <w:cantSplit/>
+        </w:trPr>
         <w:tc>
           <w:tcPr>
             <w:tcW w:type="dxa" w:w="2835"/>
           </w:tcPr>
           <w:p>
+            <w:pPr>
+              <w:keepNext/>
+            </w:pPr>
             <w:r/>
             <w:r>
               <w:rPr>
@@ -2987,6 +3717,9 @@
             <w:tcW w:type="dxa" w:w="6236"/>
           </w:tcPr>
           <w:p>
+            <w:pPr>
+              <w:keepNext/>
+            </w:pPr>
             <w:r/>
             <w:r>
               <w:rPr>
@@ -2998,11 +3731,17 @@
         </w:tc>
       </w:tr>
       <w:tr>
+        <w:trPr>
+          <w:cantSplit/>
+        </w:trPr>
         <w:tc>
           <w:tcPr>
             <w:tcW w:type="dxa" w:w="2835"/>
           </w:tcPr>
           <w:p>
+            <w:pPr>
+              <w:keepNext/>
+            </w:pPr>
             <w:r/>
             <w:r>
               <w:rPr>
@@ -3017,6 +3756,9 @@
             <w:tcW w:type="dxa" w:w="6236"/>
           </w:tcPr>
           <w:p>
+            <w:pPr>
+              <w:keepNext/>
+            </w:pPr>
             <w:r/>
             <w:r>
               <w:rPr>
@@ -3028,11 +3770,17 @@
         </w:tc>
       </w:tr>
       <w:tr>
+        <w:trPr>
+          <w:cantSplit/>
+        </w:trPr>
         <w:tc>
           <w:tcPr>
             <w:tcW w:type="dxa" w:w="2835"/>
           </w:tcPr>
           <w:p>
+            <w:pPr>
+              <w:keepNext/>
+            </w:pPr>
             <w:r/>
             <w:r>
               <w:rPr>
@@ -3047,6 +3795,9 @@
             <w:tcW w:type="dxa" w:w="6236"/>
           </w:tcPr>
           <w:p>
+            <w:pPr>
+              <w:keepNext/>
+            </w:pPr>
             <w:r/>
             <w:r>
               <w:rPr>
@@ -3058,6 +3809,9 @@
         </w:tc>
       </w:tr>
       <w:tr>
+        <w:trPr>
+          <w:cantSplit/>
+        </w:trPr>
         <w:tc>
           <w:tcPr>
             <w:tcW w:type="dxa" w:w="2835"/>
@@ -3089,17 +3843,6 @@
       </w:tr>
     </w:tbl>
     <w:p/>
-    <w:p>
-      <w:pPr>
-        <w:jc w:val="both"/>
-      </w:pPr>
-      <w:r>
-        <w:rPr>
-          <w:b w:val="0"/>
-        </w:rPr>
-        <w:t>Para ejecutar desde IntelliJ IDEA: abrir la carpeta raíz del repositorio, seleccionar un SDK 21, elegir la configuración «Caso 1 - Reserva concurrente» o «Menu principal» en la barra superior y pulsar Run. Las configuraciones se incluyen en la carpeta .run/ del repositorio.</w:t>
-      </w:r>
-    </w:p>
     <w:sectPr>
       <w:footerReference w:type="default" r:id="rId9"/>
       <w:pgSz w:w="12240" w:h="15840"/>

</xml_diff>